<commit_message>
Got service to server to work and added server
</commit_message>
<xml_diff>
--- a/paperWork/Ethics/Ethics Revised/03. Form B_v2.docx
+++ b/paperWork/Ethics/Ethics Revised/03. Form B_v2.docx
@@ -444,7 +444,7 @@
               <w:rPr>
                 <w:rFonts w:asciiTheme="majorHAnsi" w:hAnsiTheme="majorHAnsi" w:cstheme="majorHAnsi"/>
               </w:rPr>
-              <w:t>6</w:t>
+              <w:t>7</w:t>
             </w:r>
           </w:p>
         </w:tc>
@@ -2289,13 +2289,14 @@
               </w:rPr>
               <w:t xml:space="preserve">. This will remove the opportunity for the participant to delete their data and make the data fully anonymous. </w:t>
             </w:r>
-            <w:r>
-              <w:rPr>
-                <w:rFonts w:asciiTheme="majorHAnsi" w:hAnsiTheme="majorHAnsi" w:cstheme="majorHAnsi"/>
-                <w:color w:val="EE0000"/>
-              </w:rPr>
-              <w:t xml:space="preserve">The data will be destroyed after project completion or within 1 year after submission. </w:t>
-            </w:r>
+            <w:ins w:id="0" w:author="Alexander Gordon (Student)" w:date="2026-03-01T20:53:00Z" w16du:dateUtc="2026-03-01T20:53:00Z">
+              <w:r>
+                <w:rPr>
+                  <w:rFonts w:asciiTheme="majorHAnsi" w:hAnsiTheme="majorHAnsi" w:cstheme="majorHAnsi"/>
+                </w:rPr>
+                <w:t xml:space="preserve">The data will be destroyed after the project completion or within 1 year after submission. </w:t>
+              </w:r>
+            </w:ins>
             <w:r>
               <w:rPr>
                 <w:rFonts w:asciiTheme="majorHAnsi" w:hAnsiTheme="majorHAnsi" w:cstheme="majorHAnsi"/>
@@ -6064,7 +6065,37 @@
               <w:rPr>
                 <w:rFonts w:asciiTheme="majorHAnsi" w:hAnsiTheme="majorHAnsi" w:cstheme="majorHAnsi"/>
               </w:rPr>
-              <w:t>will be stored securely in University of Dundee-managed resources such as Office 365 (Outlook, Excel) and the OneDrive storage system. The data will be accessible only to the Principal Investigator (project student)</w:t>
+              <w:t>will be stored securely in University of Dundee-managed resources</w:t>
+            </w:r>
+            <w:ins w:id="1" w:author="Alexander Gordon (Student)" w:date="2026-03-01T20:55:00Z" w16du:dateUtc="2026-03-01T20:55:00Z">
+              <w:r>
+                <w:rPr>
+                  <w:rFonts w:asciiTheme="majorHAnsi" w:hAnsiTheme="majorHAnsi" w:cstheme="majorHAnsi"/>
+                </w:rPr>
+                <w:t>. Thes</w:t>
+              </w:r>
+            </w:ins>
+            <w:ins w:id="2" w:author="Alexander Gordon (Student)" w:date="2026-03-01T20:56:00Z" w16du:dateUtc="2026-03-01T20:56:00Z">
+              <w:r>
+                <w:rPr>
+                  <w:rFonts w:asciiTheme="majorHAnsi" w:hAnsiTheme="majorHAnsi" w:cstheme="majorHAnsi"/>
+                </w:rPr>
+                <w:t xml:space="preserve">e will be </w:t>
+              </w:r>
+            </w:ins>
+            <w:del w:id="3" w:author="Alexander Gordon (Student)" w:date="2026-03-01T20:55:00Z" w16du:dateUtc="2026-03-01T20:55:00Z">
+              <w:r>
+                <w:rPr>
+                  <w:rFonts w:asciiTheme="majorHAnsi" w:hAnsiTheme="majorHAnsi" w:cstheme="majorHAnsi"/>
+                </w:rPr>
+                <w:delText xml:space="preserve"> such as </w:delText>
+              </w:r>
+            </w:del>
+            <w:r>
+              <w:rPr>
+                <w:rFonts w:asciiTheme="majorHAnsi" w:hAnsiTheme="majorHAnsi" w:cstheme="majorHAnsi"/>
+              </w:rPr>
+              <w:t>Office 365 (Outlook, Excel) and the OneDrive storage system. The data will be accessible only to the Principal Investigator (project student)</w:t>
             </w:r>
             <w:r>
               <w:rPr>
@@ -6106,20 +6137,20 @@
               <w:rPr>
                 <w:rFonts w:asciiTheme="majorHAnsi" w:hAnsiTheme="majorHAnsi" w:cstheme="majorHAnsi"/>
               </w:rPr>
-              <w:t xml:space="preserve">The consent </w:t>
-            </w:r>
-            <w:r>
-              <w:rPr>
-                <w:rFonts w:asciiTheme="majorHAnsi" w:hAnsiTheme="majorHAnsi" w:cstheme="majorHAnsi"/>
-              </w:rPr>
-              <w:t xml:space="preserve">forms can </w:t>
+              <w:t xml:space="preserve">The </w:t>
             </w:r>
             <w:r>
               <w:rPr>
                 <w:rFonts w:asciiTheme="majorHAnsi" w:hAnsiTheme="majorHAnsi" w:cstheme="majorHAnsi"/>
               </w:rPr>
               <w:lastRenderedPageBreak/>
-              <w:t>be retained on University of Dundee servers / locations such as My Dundee and Blackboard Ultra for a period of up to 6 years, after which they are automatically remove</w:t>
+              <w:t xml:space="preserve">consent </w:t>
+            </w:r>
+            <w:r>
+              <w:rPr>
+                <w:rFonts w:asciiTheme="majorHAnsi" w:hAnsiTheme="majorHAnsi" w:cstheme="majorHAnsi"/>
+              </w:rPr>
+              <w:t>forms can be retained on University of Dundee servers / locations such as My Dundee and Blackboard Ultra for a period of up to 6 years, after which they are automatically remove</w:t>
             </w:r>
             <w:r>
               <w:rPr>
@@ -6445,42 +6476,226 @@
               </w:rPr>
               <w:t xml:space="preserve"> </w:t>
             </w:r>
-            <w:r>
-              <w:rPr>
-                <w:rFonts w:asciiTheme="majorHAnsi" w:hAnsiTheme="majorHAnsi" w:cstheme="majorHAnsi"/>
-              </w:rPr>
-              <w:t>Participants can contact the princip</w:t>
-            </w:r>
-            <w:r>
-              <w:rPr>
-                <w:rFonts w:asciiTheme="majorHAnsi" w:hAnsiTheme="majorHAnsi" w:cstheme="majorHAnsi"/>
-              </w:rPr>
-              <w:t>al</w:t>
-            </w:r>
-            <w:r>
-              <w:rPr>
-                <w:rFonts w:asciiTheme="majorHAnsi" w:hAnsiTheme="majorHAnsi" w:cstheme="majorHAnsi"/>
-              </w:rPr>
-              <w:t xml:space="preserve"> </w:t>
-            </w:r>
-            <w:r>
-              <w:rPr>
-                <w:rFonts w:asciiTheme="majorHAnsi" w:hAnsiTheme="majorHAnsi" w:cstheme="majorHAnsi"/>
-              </w:rPr>
-              <w:t>investigator</w:t>
-            </w:r>
-            <w:r>
-              <w:rPr>
-                <w:rFonts w:asciiTheme="majorHAnsi" w:hAnsiTheme="majorHAnsi" w:cstheme="majorHAnsi"/>
-              </w:rPr>
-              <w:t xml:space="preserve"> to request corrections to their data and/or to remove it (unless the data is anonymous and aggregated in which case it would not be possible to identify an individual’s data within it)</w:t>
-            </w:r>
-            <w:r>
-              <w:rPr>
-                <w:rFonts w:asciiTheme="majorHAnsi" w:hAnsiTheme="majorHAnsi" w:cstheme="majorHAnsi"/>
-              </w:rPr>
-              <w:t xml:space="preserve">. </w:t>
-            </w:r>
+            <w:del w:id="4" w:author="Alexander Gordon (Student)" w:date="2026-03-01T21:04:00Z" w16du:dateUtc="2026-03-01T21:04:00Z">
+              <w:r>
+                <w:rPr>
+                  <w:rFonts w:asciiTheme="majorHAnsi" w:hAnsiTheme="majorHAnsi" w:cstheme="majorHAnsi"/>
+                </w:rPr>
+                <w:delText>Participants can contact the princip</w:delText>
+              </w:r>
+              <w:r>
+                <w:rPr>
+                  <w:rFonts w:asciiTheme="majorHAnsi" w:hAnsiTheme="majorHAnsi" w:cstheme="majorHAnsi"/>
+                </w:rPr>
+                <w:delText>al</w:delText>
+              </w:r>
+              <w:r>
+                <w:rPr>
+                  <w:rFonts w:asciiTheme="majorHAnsi" w:hAnsiTheme="majorHAnsi" w:cstheme="majorHAnsi"/>
+                </w:rPr>
+                <w:delText xml:space="preserve"> </w:delText>
+              </w:r>
+              <w:r>
+                <w:rPr>
+                  <w:rFonts w:asciiTheme="majorHAnsi" w:hAnsiTheme="majorHAnsi" w:cstheme="majorHAnsi"/>
+                </w:rPr>
+                <w:delText>investigator</w:delText>
+              </w:r>
+              <w:r>
+                <w:rPr>
+                  <w:rFonts w:asciiTheme="majorHAnsi" w:hAnsiTheme="majorHAnsi" w:cstheme="majorHAnsi"/>
+                </w:rPr>
+                <w:delText xml:space="preserve"> to request corrections to their data and/or to remove it (unless the data is anonymous and aggregated in which case it would not be possible to identify an individual’s data within it)</w:delText>
+              </w:r>
+              <w:r>
+                <w:rPr>
+                  <w:rFonts w:asciiTheme="majorHAnsi" w:hAnsiTheme="majorHAnsi" w:cstheme="majorHAnsi"/>
+                </w:rPr>
+                <w:delText>.</w:delText>
+              </w:r>
+            </w:del>
+            <w:ins w:id="5" w:author="Alexander Gordon (Student)" w:date="2026-03-01T21:04:00Z" w16du:dateUtc="2026-03-01T21:04:00Z">
+              <w:r>
+                <w:rPr>
+                  <w:rFonts w:asciiTheme="majorHAnsi" w:hAnsiTheme="majorHAnsi" w:cstheme="majorHAnsi"/>
+                </w:rPr>
+                <w:t xml:space="preserve"> </w:t>
+              </w:r>
+            </w:ins>
+            <w:del w:id="6" w:author="Alexander Gordon (Student)" w:date="2026-03-01T21:04:00Z" w16du:dateUtc="2026-03-01T21:04:00Z">
+              <w:r>
+                <w:rPr>
+                  <w:rFonts w:asciiTheme="majorHAnsi" w:hAnsiTheme="majorHAnsi" w:cstheme="majorHAnsi"/>
+                </w:rPr>
+                <w:delText xml:space="preserve"> </w:delText>
+              </w:r>
+            </w:del>
+            <w:ins w:id="7" w:author="Alexander Gordon (Student)" w:date="2026-03-01T21:00:00Z" w16du:dateUtc="2026-03-01T21:00:00Z">
+              <w:r>
+                <w:rPr>
+                  <w:rFonts w:asciiTheme="majorHAnsi" w:hAnsiTheme="majorHAnsi" w:cstheme="majorHAnsi"/>
+                </w:rPr>
+                <w:t xml:space="preserve">Participants can contact </w:t>
+              </w:r>
+            </w:ins>
+            <w:ins w:id="8" w:author="Alexander Gordon (Student)" w:date="2026-03-01T21:01:00Z" w16du:dateUtc="2026-03-01T21:01:00Z">
+              <w:del w:id="9" w:author="Oluwafemi Samuel (Staff)" w:date="2026-03-02T08:22:00Z" w16du:dateUtc="2026-03-02T08:22:00Z">
+                <w:r>
+                  <w:rPr>
+                    <w:rFonts w:asciiTheme="majorHAnsi" w:hAnsiTheme="majorHAnsi" w:cstheme="majorHAnsi"/>
+                  </w:rPr>
+                  <w:delText>a researcher</w:delText>
+                </w:r>
+              </w:del>
+            </w:ins>
+            <w:ins w:id="10" w:author="Oluwafemi Samuel (Staff)" w:date="2026-03-02T08:22:00Z" w16du:dateUtc="2026-03-02T08:22:00Z">
+              <w:r>
+                <w:rPr>
+                  <w:rFonts w:asciiTheme="majorHAnsi" w:hAnsiTheme="majorHAnsi" w:cstheme="majorHAnsi"/>
+                </w:rPr>
+                <w:t>the principal investigator</w:t>
+              </w:r>
+            </w:ins>
+            <w:ins w:id="11" w:author="Alexander Gordon (Student)" w:date="2026-03-01T21:01:00Z" w16du:dateUtc="2026-03-01T21:01:00Z">
+              <w:r>
+                <w:rPr>
+                  <w:rFonts w:asciiTheme="majorHAnsi" w:hAnsiTheme="majorHAnsi" w:cstheme="majorHAnsi"/>
+                </w:rPr>
+                <w:t xml:space="preserve"> and request their information to be removed. They will need to provide their toke</w:t>
+              </w:r>
+            </w:ins>
+            <w:ins w:id="12" w:author="Alexander Gordon (Student)" w:date="2026-03-01T21:03:00Z" w16du:dateUtc="2026-03-01T21:03:00Z">
+              <w:r>
+                <w:rPr>
+                  <w:rFonts w:asciiTheme="majorHAnsi" w:hAnsiTheme="majorHAnsi" w:cstheme="majorHAnsi"/>
+                </w:rPr>
+                <w:t>n</w:t>
+              </w:r>
+              <w:del w:id="13" w:author="Oluwafemi Samuel (Staff)" w:date="2026-03-02T08:23:00Z" w16du:dateUtc="2026-03-02T08:23:00Z">
+                <w:r>
+                  <w:rPr>
+                    <w:rFonts w:asciiTheme="majorHAnsi" w:hAnsiTheme="majorHAnsi" w:cstheme="majorHAnsi"/>
+                  </w:rPr>
+                  <w:delText xml:space="preserve"> also</w:delText>
+                </w:r>
+              </w:del>
+            </w:ins>
+            <w:ins w:id="14" w:author="Alexander Gordon (Student)" w:date="2026-03-01T21:01:00Z" w16du:dateUtc="2026-03-01T21:01:00Z">
+              <w:r>
+                <w:rPr>
+                  <w:rFonts w:asciiTheme="majorHAnsi" w:hAnsiTheme="majorHAnsi" w:cstheme="majorHAnsi"/>
+                </w:rPr>
+                <w:t xml:space="preserve"> which is given to them after completion of their session. </w:t>
+              </w:r>
+              <w:r>
+                <w:rPr>
+                  <w:rFonts w:asciiTheme="majorHAnsi" w:hAnsiTheme="majorHAnsi" w:cstheme="majorHAnsi"/>
+                </w:rPr>
+                <w:t xml:space="preserve">Without </w:t>
+              </w:r>
+            </w:ins>
+            <w:ins w:id="15" w:author="Alexander Gordon (Student)" w:date="2026-03-01T21:02:00Z" w16du:dateUtc="2026-03-01T21:02:00Z">
+              <w:r>
+                <w:rPr>
+                  <w:rFonts w:asciiTheme="majorHAnsi" w:hAnsiTheme="majorHAnsi" w:cstheme="majorHAnsi"/>
+                </w:rPr>
+                <w:t xml:space="preserve">this token it is impossible for </w:t>
+              </w:r>
+              <w:del w:id="16" w:author="Oluwafemi Samuel (Staff)" w:date="2026-03-02T08:23:00Z" w16du:dateUtc="2026-03-02T08:23:00Z">
+                <w:r>
+                  <w:rPr>
+                    <w:rFonts w:asciiTheme="majorHAnsi" w:hAnsiTheme="majorHAnsi" w:cstheme="majorHAnsi"/>
+                  </w:rPr>
+                  <w:delText>researchers</w:delText>
+                </w:r>
+              </w:del>
+            </w:ins>
+            <w:ins w:id="17" w:author="Oluwafemi Samuel (Staff)" w:date="2026-03-02T08:23:00Z" w16du:dateUtc="2026-03-02T08:23:00Z">
+              <w:r>
+                <w:rPr>
+                  <w:rFonts w:asciiTheme="majorHAnsi" w:hAnsiTheme="majorHAnsi" w:cstheme="majorHAnsi"/>
+                </w:rPr>
+                <w:t>the principal investigation</w:t>
+              </w:r>
+            </w:ins>
+            <w:ins w:id="18" w:author="Alexander Gordon (Student)" w:date="2026-03-01T21:02:00Z" w16du:dateUtc="2026-03-01T21:02:00Z">
+              <w:r>
+                <w:rPr>
+                  <w:rFonts w:asciiTheme="majorHAnsi" w:hAnsiTheme="majorHAnsi" w:cstheme="majorHAnsi"/>
+                </w:rPr>
+                <w:t xml:space="preserve"> to identify their information. On</w:t>
+              </w:r>
+            </w:ins>
+            <w:ins w:id="19" w:author="Alexander Gordon (Student)" w:date="2026-03-01T21:03:00Z" w16du:dateUtc="2026-03-01T21:03:00Z">
+              <w:r>
+                <w:rPr>
+                  <w:rFonts w:asciiTheme="majorHAnsi" w:hAnsiTheme="majorHAnsi" w:cstheme="majorHAnsi"/>
+                </w:rPr>
+                <w:t>c</w:t>
+              </w:r>
+            </w:ins>
+            <w:ins w:id="20" w:author="Alexander Gordon (Student)" w:date="2026-03-01T21:02:00Z" w16du:dateUtc="2026-03-01T21:02:00Z">
+              <w:r>
+                <w:rPr>
+                  <w:rFonts w:asciiTheme="majorHAnsi" w:hAnsiTheme="majorHAnsi" w:cstheme="majorHAnsi"/>
+                </w:rPr>
+                <w:t xml:space="preserve">e the request is made and a token provided the participants data will be removed from the study. </w:t>
+              </w:r>
+            </w:ins>
+            <w:ins w:id="21" w:author="Alexander Gordon (Student)" w:date="2026-03-01T21:03:00Z" w16du:dateUtc="2026-03-01T21:03:00Z">
+              <w:r>
+                <w:rPr>
+                  <w:rFonts w:asciiTheme="majorHAnsi" w:hAnsiTheme="majorHAnsi" w:cstheme="majorHAnsi"/>
+                </w:rPr>
+                <w:t>Removal of data will not be possible two</w:t>
+              </w:r>
+            </w:ins>
+            <w:ins w:id="22" w:author="Alexander Gordon (Student)" w:date="2026-03-01T21:04:00Z" w16du:dateUtc="2026-03-01T21:04:00Z">
+              <w:r>
+                <w:rPr>
+                  <w:rFonts w:asciiTheme="majorHAnsi" w:hAnsiTheme="majorHAnsi" w:cstheme="majorHAnsi"/>
+                </w:rPr>
+                <w:t xml:space="preserve"> weeks after the </w:t>
+              </w:r>
+              <w:del w:id="23" w:author="Oluwafemi Samuel (Staff)" w:date="2026-03-02T08:24:00Z" w16du:dateUtc="2026-03-02T08:24:00Z">
+                <w:r>
+                  <w:rPr>
+                    <w:rFonts w:asciiTheme="majorHAnsi" w:hAnsiTheme="majorHAnsi" w:cstheme="majorHAnsi"/>
+                  </w:rPr>
+                  <w:delText>session</w:delText>
+                </w:r>
+              </w:del>
+            </w:ins>
+            <w:ins w:id="24" w:author="Oluwafemi Samuel (Staff)" w:date="2026-03-02T08:24:00Z" w16du:dateUtc="2026-03-02T08:24:00Z">
+              <w:r>
+                <w:rPr>
+                  <w:rFonts w:asciiTheme="majorHAnsi" w:hAnsiTheme="majorHAnsi" w:cstheme="majorHAnsi"/>
+                </w:rPr>
+                <w:t xml:space="preserve">submission of </w:t>
+              </w:r>
+              <w:r>
+                <w:rPr>
+                  <w:rFonts w:asciiTheme="majorHAnsi" w:hAnsiTheme="majorHAnsi" w:cstheme="majorHAnsi"/>
+                </w:rPr>
+                <w:t>their data</w:t>
+              </w:r>
+            </w:ins>
+            <w:ins w:id="25" w:author="Alexander Gordon (Student)" w:date="2026-03-01T21:04:00Z" w16du:dateUtc="2026-03-01T21:04:00Z">
+              <w:del w:id="26" w:author="Oluwafemi Samuel (Staff)" w:date="2026-03-02T08:24:00Z" w16du:dateUtc="2026-03-02T08:24:00Z">
+                <w:r>
+                  <w:rPr>
+                    <w:rFonts w:asciiTheme="majorHAnsi" w:hAnsiTheme="majorHAnsi" w:cstheme="majorHAnsi"/>
+                  </w:rPr>
+                  <w:delText xml:space="preserve"> is complete</w:delText>
+                </w:r>
+              </w:del>
+              <w:r>
+                <w:rPr>
+                  <w:rFonts w:asciiTheme="majorHAnsi" w:hAnsiTheme="majorHAnsi" w:cstheme="majorHAnsi"/>
+                </w:rPr>
+                <w:t xml:space="preserve">. </w:t>
+              </w:r>
+            </w:ins>
           </w:p>
           <w:p>
             <w:pPr>
@@ -6775,6 +6990,7 @@
               <w:rPr>
                 <w:rFonts w:asciiTheme="majorHAnsi" w:hAnsiTheme="majorHAnsi" w:cstheme="majorHAnsi"/>
               </w:rPr>
+              <w:lastRenderedPageBreak/>
               <w:t xml:space="preserve">5a. </w:t>
             </w:r>
             <w:r>
@@ -6897,7 +7113,6 @@
               <w:rPr>
                 <w:rFonts w:asciiTheme="majorHAnsi" w:hAnsiTheme="majorHAnsi" w:cstheme="majorHAnsi"/>
               </w:rPr>
-              <w:lastRenderedPageBreak/>
               <w:t>5c. Will your research involve the use of tissue samples (including blood and biopsies from healthy volunteers) excluding use for genetic analysis only or tissues obtained from a tissue bank?</w:t>
             </w:r>
           </w:p>
@@ -7758,14 +7973,7 @@
         <w:rPr>
           <w:rFonts w:asciiTheme="majorHAnsi" w:hAnsiTheme="majorHAnsi" w:cstheme="majorHAnsi"/>
         </w:rPr>
-        <w:t xml:space="preserve">If you have answered YES to ANY of these questions please explain why it is necessary to take the risk of potential or actual disclosure and what actions you would take if such disclosures were to occur. Please explain what advice you would take from whom before taking these actions and what </w:t>
-      </w:r>
-      <w:r>
-        <w:rPr>
-          <w:rFonts w:asciiTheme="majorHAnsi" w:hAnsiTheme="majorHAnsi" w:cstheme="majorHAnsi"/>
-        </w:rPr>
-        <w:lastRenderedPageBreak/>
-        <w:t xml:space="preserve">information you will give participants about the possible consequences of disclosing such information. </w:t>
+        <w:t xml:space="preserve">If you have answered YES to ANY of these questions please explain why it is necessary to take the risk of potential or actual disclosure and what actions you would take if such disclosures were to occur. Please explain what advice you would take from whom before taking these actions and what information you will give participants about the possible consequences of disclosing such information. </w:t>
       </w:r>
     </w:p>
     <w:tbl>
@@ -8494,7 +8702,14 @@
         <w:rPr>
           <w:rFonts w:asciiTheme="majorHAnsi" w:hAnsiTheme="majorHAnsi" w:cstheme="majorHAnsi"/>
         </w:rPr>
-        <w:t>If you have answered YES to ANY of these questions, please explain the nature of the inducement or amount of payment you will offer and the reason why it is necessary to offer inducements. You should also explain why you consider it ethically and methodologically acceptable in the context of this study to offer such payments</w:t>
+        <w:t xml:space="preserve">If you have answered YES to ANY of these questions, please explain the nature of the inducement or amount of payment you will offer and the reason why it is necessary to offer inducements. You </w:t>
+      </w:r>
+      <w:r>
+        <w:rPr>
+          <w:rFonts w:asciiTheme="majorHAnsi" w:hAnsiTheme="majorHAnsi" w:cstheme="majorHAnsi"/>
+        </w:rPr>
+        <w:lastRenderedPageBreak/>
+        <w:t>should also explain why you consider it ethically and methodologically acceptable in the context of this study to offer such payments</w:t>
       </w:r>
       <w:r>
         <w:rPr>
@@ -8590,7 +8805,7 @@
                 <w:rFonts w:asciiTheme="majorHAnsi" w:hAnsiTheme="majorHAnsi" w:cstheme="majorHAnsi"/>
               </w:rPr>
             </w:pPr>
-            <w:bookmarkStart w:id="0" w:name="_Hlk191902255"/>
+            <w:bookmarkStart w:id="27" w:name="_Hlk191902255"/>
           </w:p>
         </w:tc>
         <w:tc>
@@ -9002,7 +9217,7 @@
           </w:p>
         </w:tc>
       </w:tr>
-      <w:bookmarkEnd w:id="0"/>
+      <w:bookmarkEnd w:id="27"/>
     </w:tbl>
     <w:p>
       <w:pPr>
@@ -9281,6 +9496,7 @@
           <w:sz w:val="28"/>
           <w:szCs w:val="28"/>
         </w:rPr>
+        <w:lastRenderedPageBreak/>
         <w:t>10. Documentation</w:t>
       </w:r>
     </w:p>
@@ -9317,12 +9533,11 @@
                 <w:rFonts w:asciiTheme="majorHAnsi" w:hAnsiTheme="majorHAnsi" w:cstheme="majorHAnsi"/>
               </w:rPr>
             </w:pPr>
-            <w:bookmarkStart w:id="1" w:name="_Hlk191902319"/>
-            <w:r>
-              <w:rPr>
-                <w:rFonts w:asciiTheme="majorHAnsi" w:hAnsiTheme="majorHAnsi" w:cstheme="majorHAnsi"/>
-              </w:rPr>
-              <w:lastRenderedPageBreak/>
+            <w:bookmarkStart w:id="28" w:name="_Hlk191902319"/>
+            <w:r>
+              <w:rPr>
+                <w:rFonts w:asciiTheme="majorHAnsi" w:hAnsiTheme="majorHAnsi" w:cstheme="majorHAnsi"/>
+              </w:rPr>
               <w:t>The following documents are attached:</w:t>
             </w:r>
           </w:p>
@@ -9427,17 +9642,55 @@
               </w:rPr>
               <w:t xml:space="preserve"> Last Updated </w:t>
             </w:r>
-            <w:r>
-              <w:rPr>
-                <w:rFonts w:asciiTheme="majorHAnsi" w:hAnsiTheme="majorHAnsi" w:cstheme="majorHAnsi"/>
-              </w:rPr>
-              <w:t>26</w:t>
-            </w:r>
-            <w:r>
-              <w:rPr>
-                <w:rFonts w:asciiTheme="majorHAnsi" w:hAnsiTheme="majorHAnsi" w:cstheme="majorHAnsi"/>
-              </w:rPr>
-              <w:t xml:space="preserve"> February 2026</w:t>
+            <w:ins w:id="29" w:author="Alexander Gordon (Student)" w:date="2026-03-01T21:14:00Z" w16du:dateUtc="2026-03-01T21:14:00Z">
+              <w:r>
+                <w:rPr>
+                  <w:rFonts w:asciiTheme="majorHAnsi" w:hAnsiTheme="majorHAnsi" w:cstheme="majorHAnsi"/>
+                </w:rPr>
+                <w:t>1</w:t>
+              </w:r>
+            </w:ins>
+            <w:del w:id="30" w:author="Alexander Gordon (Student)" w:date="2026-03-01T21:14:00Z" w16du:dateUtc="2026-03-01T21:14:00Z">
+              <w:r>
+                <w:rPr>
+                  <w:rFonts w:asciiTheme="majorHAnsi" w:hAnsiTheme="majorHAnsi" w:cstheme="majorHAnsi"/>
+                </w:rPr>
+                <w:delText>26</w:delText>
+              </w:r>
+            </w:del>
+            <w:r>
+              <w:rPr>
+                <w:rFonts w:asciiTheme="majorHAnsi" w:hAnsiTheme="majorHAnsi" w:cstheme="majorHAnsi"/>
+              </w:rPr>
+              <w:t xml:space="preserve"> </w:t>
+            </w:r>
+            <w:del w:id="31" w:author="Alexander Gordon (Student)" w:date="2026-03-01T21:14:00Z" w16du:dateUtc="2026-03-01T21:14:00Z">
+              <w:r>
+                <w:rPr>
+                  <w:rFonts w:asciiTheme="majorHAnsi" w:hAnsiTheme="majorHAnsi" w:cstheme="majorHAnsi"/>
+                </w:rPr>
+                <w:delText xml:space="preserve">February </w:delText>
+              </w:r>
+            </w:del>
+            <w:ins w:id="32" w:author="Alexander Gordon (Student)" w:date="2026-03-01T21:14:00Z" w16du:dateUtc="2026-03-01T21:14:00Z">
+              <w:r>
+                <w:rPr>
+                  <w:rFonts w:asciiTheme="majorHAnsi" w:hAnsiTheme="majorHAnsi" w:cstheme="majorHAnsi"/>
+                </w:rPr>
+                <w:t>March</w:t>
+              </w:r>
+              <w:r>
+                <w:rPr>
+                  <w:rFonts w:asciiTheme="majorHAnsi" w:hAnsiTheme="majorHAnsi" w:cstheme="majorHAnsi"/>
+                </w:rPr>
+                <w:t xml:space="preserve"> </w:t>
+              </w:r>
+            </w:ins>
+            <w:r>
+              <w:rPr>
+                <w:rFonts w:asciiTheme="majorHAnsi" w:hAnsiTheme="majorHAnsi" w:cstheme="majorHAnsi"/>
+              </w:rPr>
+              <w:t>2026</w:t>
             </w:r>
             <w:r>
               <w:rPr>
@@ -9529,17 +9782,61 @@
               </w:rPr>
               <w:t xml:space="preserve">. Last Updated </w:t>
             </w:r>
-            <w:r>
-              <w:rPr>
-                <w:rFonts w:asciiTheme="majorHAnsi" w:hAnsiTheme="majorHAnsi" w:cstheme="majorHAnsi"/>
-              </w:rPr>
-              <w:t>26</w:t>
-            </w:r>
-            <w:r>
-              <w:rPr>
-                <w:rFonts w:asciiTheme="majorHAnsi" w:hAnsiTheme="majorHAnsi" w:cstheme="majorHAnsi"/>
-              </w:rPr>
-              <w:t xml:space="preserve"> February 2026</w:t>
+            <w:del w:id="33" w:author="Alexander Gordon (Student)" w:date="2026-03-01T21:15:00Z" w16du:dateUtc="2026-03-01T21:15:00Z">
+              <w:r>
+                <w:rPr>
+                  <w:rFonts w:asciiTheme="majorHAnsi" w:hAnsiTheme="majorHAnsi" w:cstheme="majorHAnsi"/>
+                </w:rPr>
+                <w:delText>26</w:delText>
+              </w:r>
+              <w:r>
+                <w:rPr>
+                  <w:rFonts w:asciiTheme="majorHAnsi" w:hAnsiTheme="majorHAnsi" w:cstheme="majorHAnsi"/>
+                </w:rPr>
+                <w:delText xml:space="preserve"> </w:delText>
+              </w:r>
+            </w:del>
+            <w:ins w:id="34" w:author="Alexander Gordon (Student)" w:date="2026-03-01T21:15:00Z" w16du:dateUtc="2026-03-01T21:15:00Z">
+              <w:r>
+                <w:rPr>
+                  <w:rFonts w:asciiTheme="majorHAnsi" w:hAnsiTheme="majorHAnsi" w:cstheme="majorHAnsi"/>
+                </w:rPr>
+                <w:t>1</w:t>
+              </w:r>
+              <w:r>
+                <w:rPr>
+                  <w:rFonts w:asciiTheme="majorHAnsi" w:hAnsiTheme="majorHAnsi" w:cstheme="majorHAnsi"/>
+                </w:rPr>
+                <w:t xml:space="preserve"> </w:t>
+              </w:r>
+            </w:ins>
+            <w:del w:id="35" w:author="Alexander Gordon (Student)" w:date="2026-03-01T21:15:00Z" w16du:dateUtc="2026-03-01T21:15:00Z">
+              <w:r>
+                <w:rPr>
+                  <w:rFonts w:asciiTheme="majorHAnsi" w:hAnsiTheme="majorHAnsi" w:cstheme="majorHAnsi"/>
+                </w:rPr>
+                <w:delText xml:space="preserve">February </w:delText>
+              </w:r>
+            </w:del>
+            <w:ins w:id="36" w:author="Alexander Gordon (Student)" w:date="2026-03-01T21:15:00Z" w16du:dateUtc="2026-03-01T21:15:00Z">
+              <w:r>
+                <w:rPr>
+                  <w:rFonts w:asciiTheme="majorHAnsi" w:hAnsiTheme="majorHAnsi" w:cstheme="majorHAnsi"/>
+                </w:rPr>
+                <w:t>March</w:t>
+              </w:r>
+              <w:r>
+                <w:rPr>
+                  <w:rFonts w:asciiTheme="majorHAnsi" w:hAnsiTheme="majorHAnsi" w:cstheme="majorHAnsi"/>
+                </w:rPr>
+                <w:t xml:space="preserve"> </w:t>
+              </w:r>
+            </w:ins>
+            <w:r>
+              <w:rPr>
+                <w:rFonts w:asciiTheme="majorHAnsi" w:hAnsiTheme="majorHAnsi" w:cstheme="majorHAnsi"/>
+              </w:rPr>
+              <w:t>2026</w:t>
             </w:r>
             <w:r>
               <w:rPr>
@@ -9589,17 +9886,63 @@
               </w:rPr>
               <w:t xml:space="preserve">. Last Updated </w:t>
             </w:r>
-            <w:r>
-              <w:rPr>
-                <w:rFonts w:asciiTheme="majorHAnsi" w:hAnsiTheme="majorHAnsi" w:cstheme="majorHAnsi"/>
-              </w:rPr>
-              <w:t>26</w:t>
-            </w:r>
-            <w:r>
-              <w:rPr>
-                <w:rFonts w:asciiTheme="majorHAnsi" w:hAnsiTheme="majorHAnsi" w:cstheme="majorHAnsi"/>
-              </w:rPr>
-              <w:t xml:space="preserve"> February 2026</w:t>
+            <w:ins w:id="37" w:author="Alexander Gordon (Student)" w:date="2026-03-01T21:15:00Z" w16du:dateUtc="2026-03-01T21:15:00Z">
+              <w:r>
+                <w:rPr>
+                  <w:rFonts w:asciiTheme="majorHAnsi" w:hAnsiTheme="majorHAnsi" w:cstheme="majorHAnsi"/>
+                </w:rPr>
+                <w:t>1</w:t>
+              </w:r>
+            </w:ins>
+            <w:del w:id="38" w:author="Alexander Gordon (Student)" w:date="2026-03-01T21:15:00Z" w16du:dateUtc="2026-03-01T21:15:00Z">
+              <w:r>
+                <w:rPr>
+                  <w:rFonts w:asciiTheme="majorHAnsi" w:hAnsiTheme="majorHAnsi" w:cstheme="majorHAnsi"/>
+                </w:rPr>
+                <w:delText>2</w:delText>
+              </w:r>
+            </w:del>
+            <w:del w:id="39" w:author="Alexander Gordon (Student)" w:date="2026-03-01T21:14:00Z" w16du:dateUtc="2026-03-01T21:14:00Z">
+              <w:r>
+                <w:rPr>
+                  <w:rFonts w:asciiTheme="majorHAnsi" w:hAnsiTheme="majorHAnsi" w:cstheme="majorHAnsi"/>
+                </w:rPr>
+                <w:delText>6</w:delText>
+              </w:r>
+            </w:del>
+            <w:r>
+              <w:rPr>
+                <w:rFonts w:asciiTheme="majorHAnsi" w:hAnsiTheme="majorHAnsi" w:cstheme="majorHAnsi"/>
+              </w:rPr>
+              <w:t xml:space="preserve"> </w:t>
+            </w:r>
+            <w:del w:id="40" w:author="Alexander Gordon (Student)" w:date="2026-03-01T21:14:00Z" w16du:dateUtc="2026-03-01T21:14:00Z">
+              <w:r>
+                <w:rPr>
+                  <w:rFonts w:asciiTheme="majorHAnsi" w:hAnsiTheme="majorHAnsi" w:cstheme="majorHAnsi"/>
+                </w:rPr>
+                <w:delText xml:space="preserve">February </w:delText>
+              </w:r>
+            </w:del>
+            <w:ins w:id="41" w:author="Alexander Gordon (Student)" w:date="2026-03-01T21:14:00Z" w16du:dateUtc="2026-03-01T21:14:00Z">
+              <w:r>
+                <w:rPr>
+                  <w:rFonts w:asciiTheme="majorHAnsi" w:hAnsiTheme="majorHAnsi" w:cstheme="majorHAnsi"/>
+                </w:rPr>
+                <w:t>March</w:t>
+              </w:r>
+              <w:r>
+                <w:rPr>
+                  <w:rFonts w:asciiTheme="majorHAnsi" w:hAnsiTheme="majorHAnsi" w:cstheme="majorHAnsi"/>
+                </w:rPr>
+                <w:t xml:space="preserve"> </w:t>
+              </w:r>
+            </w:ins>
+            <w:r>
+              <w:rPr>
+                <w:rFonts w:asciiTheme="majorHAnsi" w:hAnsiTheme="majorHAnsi" w:cstheme="majorHAnsi"/>
+              </w:rPr>
+              <w:t>2026</w:t>
             </w:r>
             <w:r>
               <w:rPr>
@@ -9706,7 +10049,7 @@
           </w:p>
         </w:tc>
       </w:tr>
-      <w:bookmarkEnd w:id="1"/>
+      <w:bookmarkEnd w:id="28"/>
     </w:tbl>
     <w:p>
       <w:pPr>
@@ -10105,6 +10448,7 @@
           <w:rFonts w:asciiTheme="majorHAnsi" w:hAnsiTheme="majorHAnsi" w:cstheme="majorHAnsi"/>
           <w:b/>
         </w:rPr>
+        <w:lastRenderedPageBreak/>
         <w:br w:type="page"/>
       </w:r>
     </w:p>
@@ -10217,19 +10561,57 @@
         <w:rPr>
           <w:rFonts w:asciiTheme="majorHAnsi" w:hAnsiTheme="majorHAnsi" w:cstheme="majorHAnsi"/>
         </w:rPr>
-        <w:t xml:space="preserve"> 1</w:t>
-      </w:r>
-      <w:r>
-        <w:rPr>
-          <w:rFonts w:asciiTheme="majorHAnsi" w:hAnsiTheme="majorHAnsi" w:cstheme="majorHAnsi"/>
-        </w:rPr>
-        <w:t>5</w:t>
-      </w:r>
-      <w:r>
-        <w:rPr>
-          <w:rFonts w:asciiTheme="majorHAnsi" w:hAnsiTheme="majorHAnsi" w:cstheme="majorHAnsi"/>
-        </w:rPr>
-        <w:t>/02/2026</w:t>
+        <w:t xml:space="preserve"> </w:t>
+      </w:r>
+      <w:ins w:id="42" w:author="Alexander Gordon (Student)" w:date="2026-03-02T11:07:00Z" w16du:dateUtc="2026-03-02T11:07:00Z">
+        <w:r>
+          <w:rPr>
+            <w:rFonts w:asciiTheme="majorHAnsi" w:hAnsiTheme="majorHAnsi" w:cstheme="majorHAnsi"/>
+          </w:rPr>
+          <w:t>2</w:t>
+        </w:r>
+      </w:ins>
+      <w:del w:id="43" w:author="Alexander Gordon (Student)" w:date="2026-03-02T11:07:00Z" w16du:dateUtc="2026-03-02T11:07:00Z">
+        <w:r>
+          <w:rPr>
+            <w:rFonts w:asciiTheme="majorHAnsi" w:hAnsiTheme="majorHAnsi" w:cstheme="majorHAnsi"/>
+          </w:rPr>
+          <w:delText>1</w:delText>
+        </w:r>
+        <w:r>
+          <w:rPr>
+            <w:rFonts w:asciiTheme="majorHAnsi" w:hAnsiTheme="majorHAnsi" w:cstheme="majorHAnsi"/>
+          </w:rPr>
+          <w:delText>5</w:delText>
+        </w:r>
+      </w:del>
+      <w:r>
+        <w:rPr>
+          <w:rFonts w:asciiTheme="majorHAnsi" w:hAnsiTheme="majorHAnsi" w:cstheme="majorHAnsi"/>
+        </w:rPr>
+        <w:t>/0</w:t>
+      </w:r>
+      <w:ins w:id="44" w:author="Alexander Gordon (Student)" w:date="2026-03-02T11:07:00Z" w16du:dateUtc="2026-03-02T11:07:00Z">
+        <w:r>
+          <w:rPr>
+            <w:rFonts w:asciiTheme="majorHAnsi" w:hAnsiTheme="majorHAnsi" w:cstheme="majorHAnsi"/>
+          </w:rPr>
+          <w:t>3</w:t>
+        </w:r>
+      </w:ins>
+      <w:del w:id="45" w:author="Alexander Gordon (Student)" w:date="2026-03-02T11:07:00Z" w16du:dateUtc="2026-03-02T11:07:00Z">
+        <w:r>
+          <w:rPr>
+            <w:rFonts w:asciiTheme="majorHAnsi" w:hAnsiTheme="majorHAnsi" w:cstheme="majorHAnsi"/>
+          </w:rPr>
+          <w:delText>2</w:delText>
+        </w:r>
+      </w:del>
+      <w:r>
+        <w:rPr>
+          <w:rFonts w:asciiTheme="majorHAnsi" w:hAnsiTheme="majorHAnsi" w:cstheme="majorHAnsi"/>
+        </w:rPr>
+        <w:t>/2026</w:t>
       </w:r>
     </w:p>
     <w:p>
@@ -10360,7 +10742,19 @@
         <w:rPr>
           <w:rFonts w:asciiTheme="majorHAnsi" w:hAnsiTheme="majorHAnsi" w:cstheme="majorHAnsi"/>
         </w:rPr>
-        <w:t xml:space="preserve"> 15-02-2026</w:t>
+        <w:t xml:space="preserve"> </w:t>
+      </w:r>
+      <w:r>
+        <w:rPr>
+          <w:rFonts w:asciiTheme="majorHAnsi" w:hAnsiTheme="majorHAnsi" w:cstheme="majorHAnsi"/>
+        </w:rPr>
+        <w:t>02/03/</w:t>
+      </w:r>
+      <w:r>
+        <w:rPr>
+          <w:rFonts w:asciiTheme="majorHAnsi" w:hAnsiTheme="majorHAnsi" w:cstheme="majorHAnsi"/>
+        </w:rPr>
+        <w:t>2027</w:t>
       </w:r>
     </w:p>
     <w:p>
@@ -15005,6 +15399,17 @@
     <w:abstractNumId w:val="26"/>
   </w:num>
 </w:numbering>
+</file>
+
+<file path=word/people.xml><?xml version="1.0" encoding="utf-8"?>
+<w15:people xmlns:wpc="http://schemas.microsoft.com/office/word/2010/wordprocessingCanvas" xmlns:cx="http://schemas.microsoft.com/office/drawing/2014/chartex" xmlns:cx1="http://schemas.microsoft.com/office/drawing/2015/9/8/chartex" xmlns:cx2="http://schemas.microsoft.com/office/drawing/2015/10/21/chartex" xmlns:cx3="http://schemas.microsoft.com/office/drawing/2016/5/9/chartex" xmlns:cx4="http://schemas.microsoft.com/office/drawing/2016/5/10/chartex" xmlns:cx5="http://schemas.microsoft.com/office/drawing/2016/5/11/chartex" xmlns:cx6="http://schemas.microsoft.com/office/drawing/2016/5/12/chartex" xmlns:cx7="http://schemas.microsoft.com/office/drawing/2016/5/13/chartex" xmlns:cx8="http://schemas.microsoft.com/office/drawing/2016/5/14/chartex" xmlns:mc="http://schemas.openxmlformats.org/markup-compatibility/2006" xmlns:aink="http://schemas.microsoft.com/office/drawing/2016/ink" xmlns:am3d="http://schemas.microsoft.com/office/drawing/2017/model3d" xmlns:o="urn:schemas-microsoft-com:office:office" xmlns:oel="http://schemas.microsoft.com/office/2019/extlst" xmlns:r="http://schemas.openxmlformats.org/officeDocument/2006/relationships" xmlns:m="http://schemas.openxmlformats.org/officeDocument/2006/math" xmlns:v="urn:schemas-microsoft-com:vml" xmlns:wp14="http://schemas.microsoft.com/office/word/2010/wordprocessingDrawing" xmlns:wp="http://schemas.openxmlformats.org/drawingml/2006/wordprocessingDrawing" xmlns:w10="urn:schemas-microsoft-com:office:word" xmlns:w="http://schemas.openxmlformats.org/wordprocessingml/2006/main" xmlns:w14="http://schemas.microsoft.com/office/word/2010/wordml" xmlns:w15="http://schemas.microsoft.com/office/word/2012/wordml" xmlns:w16cex="http://schemas.microsoft.com/office/word/2018/wordml/cex" xmlns:w16cid="http://schemas.microsoft.com/office/word/2016/wordml/cid" xmlns:w16="http://schemas.microsoft.com/office/word/2018/wordml" xmlns:w16du="http://schemas.microsoft.com/office/word/2023/wordml/word16du" xmlns:w16sdtdh="http://schemas.microsoft.com/office/word/2020/wordml/sdtdatahash" xmlns:w16sdtfl="http://schemas.microsoft.com/office/word/2024/wordml/sdtformatlock" xmlns:w16se="http://schemas.microsoft.com/office/word/2015/wordml/symex" xmlns:wpg="http://schemas.microsoft.com/office/word/2010/wordprocessingGroup" xmlns:wpi="http://schemas.microsoft.com/office/word/2010/wordprocessingInk" xmlns:wne="http://schemas.microsoft.com/office/word/2006/wordml" xmlns:wps="http://schemas.microsoft.com/office/word/2010/wordprocessingShape" mc:Ignorable="w14 w15 w16se w16cid w16 w16cex w16sdtdh w16sdtfl w16du wp14">
+  <w15:person w15:author="Alexander Gordon (Student)">
+    <w15:presenceInfo w15:providerId="AD" w15:userId="S::2502331@dundee.ac.uk::9b83ea64-f2e7-4dd6-916c-fa875a1fe8a6"/>
+  </w15:person>
+  <w15:person w15:author="Oluwafemi Samuel (Staff)">
+    <w15:presenceInfo w15:providerId="AD" w15:userId="S::OSamuel002@dundee.ac.uk::74e0c171-373e-4749-b077-9be3f619f000"/>
+  </w15:person>
+</w15:people>
 </file>
 
 <file path=word/styles.xml><?xml version="1.0" encoding="utf-8"?>
@@ -16152,6 +16557,10 @@
 </file>
 
 <file path=customXml/item1.xml><?xml version="1.0" encoding="utf-8"?>
+<b:Sources xmlns:b="http://schemas.openxmlformats.org/officeDocument/2006/bibliography" xmlns="http://schemas.openxmlformats.org/officeDocument/2006/bibliography" SelectedStyle="\APASixthEditionOfficeOnline.xsl" StyleName="APA" Version="6"/>
+</file>
+
+<file path=customXml/item2.xml><?xml version="1.0" encoding="utf-8"?>
 <ct:contentTypeSchema xmlns:ct="http://schemas.microsoft.com/office/2006/metadata/contentType" xmlns:ma="http://schemas.microsoft.com/office/2006/metadata/properties/metaAttributes" ct:_="" ma:_="" ma:contentTypeName="Document" ma:contentTypeID="0x010100E21E2FC40F2F9849A2101429659C885F" ma:contentTypeVersion="18" ma:contentTypeDescription="Create a new document." ma:contentTypeScope="" ma:versionID="846039444d366d22fd92ed571c056e6a">
   <xsd:schema xmlns:xsd="http://www.w3.org/2001/XMLSchema" xmlns:xs="http://www.w3.org/2001/XMLSchema" xmlns:p="http://schemas.microsoft.com/office/2006/metadata/properties" xmlns:ns3="57d8a762-ad9e-4d6d-b050-672b9de5a367" xmlns:ns4="69302c11-379d-46f2-838b-87b5f21836a2" targetNamespace="http://schemas.microsoft.com/office/2006/metadata/properties" ma:root="true" ma:fieldsID="224c7245fac8abc9a7dcb4d94b86958a" ns3:_="" ns4:_="">
     <xsd:import namespace="57d8a762-ad9e-4d6d-b050-672b9de5a367"/>
@@ -16404,19 +16813,7 @@
 </ct:contentTypeSchema>
 </file>
 
-<file path=customXml/item2.xml><?xml version="1.0" encoding="utf-8"?>
-<b:Sources xmlns:b="http://schemas.openxmlformats.org/officeDocument/2006/bibliography" xmlns="http://schemas.openxmlformats.org/officeDocument/2006/bibliography" SelectedStyle="\APASixthEditionOfficeOnline.xsl" StyleName="APA" Version="6"/>
-</file>
-
 <file path=customXml/item3.xml><?xml version="1.0" encoding="utf-8"?>
-<p:properties xmlns:p="http://schemas.microsoft.com/office/2006/metadata/properties" xmlns:xsi="http://www.w3.org/2001/XMLSchema-instance" xmlns:pc="http://schemas.microsoft.com/office/infopath/2007/PartnerControls">
-  <documentManagement>
-    <_activity xmlns="57d8a762-ad9e-4d6d-b050-672b9de5a367" xsi:nil="true"/>
-  </documentManagement>
-</p:properties>
-</file>
-
-<file path=customXml/item4.xml><?xml version="1.0" encoding="utf-8"?>
 <?mso-contentType ?>
 <FormTemplates xmlns="http://schemas.microsoft.com/sharepoint/v3/contenttype/forms">
   <Display>DocumentLibraryForm</Display>
@@ -16425,7 +16822,23 @@
 </FormTemplates>
 </file>
 
+<file path=customXml/item4.xml><?xml version="1.0" encoding="utf-8"?>
+<p:properties xmlns:p="http://schemas.microsoft.com/office/2006/metadata/properties" xmlns:xsi="http://www.w3.org/2001/XMLSchema-instance" xmlns:pc="http://schemas.microsoft.com/office/infopath/2007/PartnerControls">
+  <documentManagement>
+    <_activity xmlns="57d8a762-ad9e-4d6d-b050-672b9de5a367" xsi:nil="true"/>
+  </documentManagement>
+</p:properties>
+</file>
+
 <file path=customXml/itemProps1.xml><?xml version="1.0" encoding="utf-8"?>
+<ds:datastoreItem xmlns:ds="http://schemas.openxmlformats.org/officeDocument/2006/customXml" ds:itemID="{2F9030A0-6EE7-44DE-95FE-59CC9C6157CE}">
+  <ds:schemaRefs>
+    <ds:schemaRef ds:uri="http://schemas.openxmlformats.org/officeDocument/2006/bibliography"/>
+  </ds:schemaRefs>
+</ds:datastoreItem>
+</file>
+
+<file path=customXml/itemProps2.xml><?xml version="1.0" encoding="utf-8"?>
 <ds:datastoreItem xmlns:ds="http://schemas.openxmlformats.org/officeDocument/2006/customXml" ds:itemID="{44161078-4144-4F37-800E-D77C820BE783}">
   <ds:schemaRefs>
     <ds:schemaRef ds:uri="http://schemas.microsoft.com/office/2006/metadata/contentType"/>
@@ -16444,15 +16857,15 @@
 </ds:datastoreItem>
 </file>
 
-<file path=customXml/itemProps2.xml><?xml version="1.0" encoding="utf-8"?>
-<ds:datastoreItem xmlns:ds="http://schemas.openxmlformats.org/officeDocument/2006/customXml" ds:itemID="{2F9030A0-6EE7-44DE-95FE-59CC9C6157CE}">
+<file path=customXml/itemProps3.xml><?xml version="1.0" encoding="utf-8"?>
+<ds:datastoreItem xmlns:ds="http://schemas.openxmlformats.org/officeDocument/2006/customXml" ds:itemID="{DC8816E8-4B7F-4AFE-903F-4F41526C5A75}">
   <ds:schemaRefs>
-    <ds:schemaRef ds:uri="http://schemas.openxmlformats.org/officeDocument/2006/bibliography"/>
+    <ds:schemaRef ds:uri="http://schemas.microsoft.com/sharepoint/v3/contenttype/forms"/>
   </ds:schemaRefs>
 </ds:datastoreItem>
 </file>
 
-<file path=customXml/itemProps3.xml><?xml version="1.0" encoding="utf-8"?>
+<file path=customXml/itemProps4.xml><?xml version="1.0" encoding="utf-8"?>
 <ds:datastoreItem xmlns:ds="http://schemas.openxmlformats.org/officeDocument/2006/customXml" ds:itemID="{5F094DC4-E785-4ACF-8C93-6A017C0AE2A7}">
   <ds:schemaRefs>
     <ds:schemaRef ds:uri="http://schemas.microsoft.com/office/2006/metadata/properties"/>
@@ -16460,12 +16873,4 @@
     <ds:schemaRef ds:uri="57d8a762-ad9e-4d6d-b050-672b9de5a367"/>
   </ds:schemaRefs>
 </ds:datastoreItem>
-</file>
-
-<file path=customXml/itemProps4.xml><?xml version="1.0" encoding="utf-8"?>
-<ds:datastoreItem xmlns:ds="http://schemas.openxmlformats.org/officeDocument/2006/customXml" ds:itemID="{DC8816E8-4B7F-4AFE-903F-4F41526C5A75}">
-  <ds:schemaRefs>
-    <ds:schemaRef ds:uri="http://schemas.microsoft.com/sharepoint/v3/contenttype/forms"/>
-  </ds:schemaRefs>
-</ds:datastoreItem>
 </file>
</xml_diff>

<commit_message>
adding tokens into the progect and different endpoints in the server.
</commit_message>
<xml_diff>
--- a/paperWork/Ethics/Ethics Revised/03. Form B_v2.docx
+++ b/paperWork/Ethics/Ethics Revised/03. Form B_v2.docx
@@ -359,11 +359,27 @@
                 <w:rFonts w:asciiTheme="majorHAnsi" w:hAnsiTheme="majorHAnsi" w:cstheme="majorHAnsi"/>
               </w:rPr>
             </w:pPr>
-            <w:r>
-              <w:rPr>
-                <w:rFonts w:asciiTheme="majorHAnsi" w:hAnsiTheme="majorHAnsi" w:cstheme="majorHAnsi"/>
-              </w:rPr>
-              <w:t>1st Ma</w:t>
+            <w:ins w:id="0" w:author="Alexander Gordon (Student)" w:date="2026-03-04T14:36:00Z" w16du:dateUtc="2026-03-04T14:36:00Z">
+              <w:r>
+                <w:rPr>
+                  <w:rFonts w:asciiTheme="majorHAnsi" w:hAnsiTheme="majorHAnsi" w:cstheme="majorHAnsi"/>
+                </w:rPr>
+                <w:t>6</w:t>
+              </w:r>
+            </w:ins>
+            <w:del w:id="1" w:author="Alexander Gordon (Student)" w:date="2026-03-04T14:36:00Z" w16du:dateUtc="2026-03-04T14:36:00Z">
+              <w:r>
+                <w:rPr>
+                  <w:rFonts w:asciiTheme="majorHAnsi" w:hAnsiTheme="majorHAnsi" w:cstheme="majorHAnsi"/>
+                </w:rPr>
+                <w:delText>1</w:delText>
+              </w:r>
+            </w:del>
+            <w:r>
+              <w:rPr>
+                <w:rFonts w:asciiTheme="majorHAnsi" w:hAnsiTheme="majorHAnsi" w:cstheme="majorHAnsi"/>
+              </w:rPr>
+              <w:t>st Ma</w:t>
             </w:r>
             <w:r>
               <w:rPr>
@@ -2289,7 +2305,7 @@
               </w:rPr>
               <w:t xml:space="preserve">. This will remove the opportunity for the participant to delete their data and make the data fully anonymous. </w:t>
             </w:r>
-            <w:ins w:id="0" w:author="Alexander Gordon (Student)" w:date="2026-03-01T20:53:00Z" w16du:dateUtc="2026-03-01T20:53:00Z">
+            <w:ins w:id="2" w:author="Alexander Gordon (Student)" w:date="2026-03-01T20:53:00Z" w16du:dateUtc="2026-03-01T20:53:00Z">
               <w:r>
                 <w:rPr>
                   <w:rFonts w:asciiTheme="majorHAnsi" w:hAnsiTheme="majorHAnsi" w:cstheme="majorHAnsi"/>
@@ -6067,7 +6083,7 @@
               </w:rPr>
               <w:t>will be stored securely in University of Dundee-managed resources</w:t>
             </w:r>
-            <w:ins w:id="1" w:author="Alexander Gordon (Student)" w:date="2026-03-01T20:55:00Z" w16du:dateUtc="2026-03-01T20:55:00Z">
+            <w:ins w:id="3" w:author="Alexander Gordon (Student)" w:date="2026-03-01T20:55:00Z" w16du:dateUtc="2026-03-01T20:55:00Z">
               <w:r>
                 <w:rPr>
                   <w:rFonts w:asciiTheme="majorHAnsi" w:hAnsiTheme="majorHAnsi" w:cstheme="majorHAnsi"/>
@@ -6075,7 +6091,7 @@
                 <w:t>. Thes</w:t>
               </w:r>
             </w:ins>
-            <w:ins w:id="2" w:author="Alexander Gordon (Student)" w:date="2026-03-01T20:56:00Z" w16du:dateUtc="2026-03-01T20:56:00Z">
+            <w:ins w:id="4" w:author="Alexander Gordon (Student)" w:date="2026-03-01T20:56:00Z" w16du:dateUtc="2026-03-01T20:56:00Z">
               <w:r>
                 <w:rPr>
                   <w:rFonts w:asciiTheme="majorHAnsi" w:hAnsiTheme="majorHAnsi" w:cstheme="majorHAnsi"/>
@@ -6083,7 +6099,7 @@
                 <w:t xml:space="preserve">e will be </w:t>
               </w:r>
             </w:ins>
-            <w:del w:id="3" w:author="Alexander Gordon (Student)" w:date="2026-03-01T20:55:00Z" w16du:dateUtc="2026-03-01T20:55:00Z">
+            <w:del w:id="5" w:author="Alexander Gordon (Student)" w:date="2026-03-01T20:55:00Z" w16du:dateUtc="2026-03-01T20:55:00Z">
               <w:r>
                 <w:rPr>
                   <w:rFonts w:asciiTheme="majorHAnsi" w:hAnsiTheme="majorHAnsi" w:cstheme="majorHAnsi"/>
@@ -6476,7 +6492,7 @@
               </w:rPr>
               <w:t xml:space="preserve"> </w:t>
             </w:r>
-            <w:del w:id="4" w:author="Alexander Gordon (Student)" w:date="2026-03-01T21:04:00Z" w16du:dateUtc="2026-03-01T21:04:00Z">
+            <w:del w:id="6" w:author="Alexander Gordon (Student)" w:date="2026-03-01T21:04:00Z" w16du:dateUtc="2026-03-01T21:04:00Z">
               <w:r>
                 <w:rPr>
                   <w:rFonts w:asciiTheme="majorHAnsi" w:hAnsiTheme="majorHAnsi" w:cstheme="majorHAnsi"/>
@@ -6514,7 +6530,7 @@
                 <w:delText>.</w:delText>
               </w:r>
             </w:del>
-            <w:ins w:id="5" w:author="Alexander Gordon (Student)" w:date="2026-03-01T21:04:00Z" w16du:dateUtc="2026-03-01T21:04:00Z">
+            <w:ins w:id="7" w:author="Alexander Gordon (Student)" w:date="2026-03-01T21:04:00Z" w16du:dateUtc="2026-03-01T21:04:00Z">
               <w:r>
                 <w:rPr>
                   <w:rFonts w:asciiTheme="majorHAnsi" w:hAnsiTheme="majorHAnsi" w:cstheme="majorHAnsi"/>
@@ -6522,7 +6538,7 @@
                 <w:t xml:space="preserve"> </w:t>
               </w:r>
             </w:ins>
-            <w:del w:id="6" w:author="Alexander Gordon (Student)" w:date="2026-03-01T21:04:00Z" w16du:dateUtc="2026-03-01T21:04:00Z">
+            <w:del w:id="8" w:author="Alexander Gordon (Student)" w:date="2026-03-01T21:04:00Z" w16du:dateUtc="2026-03-01T21:04:00Z">
               <w:r>
                 <w:rPr>
                   <w:rFonts w:asciiTheme="majorHAnsi" w:hAnsiTheme="majorHAnsi" w:cstheme="majorHAnsi"/>
@@ -6530,7 +6546,7 @@
                 <w:delText xml:space="preserve"> </w:delText>
               </w:r>
             </w:del>
-            <w:ins w:id="7" w:author="Alexander Gordon (Student)" w:date="2026-03-01T21:00:00Z" w16du:dateUtc="2026-03-01T21:00:00Z">
+            <w:ins w:id="9" w:author="Alexander Gordon (Student)" w:date="2026-03-01T21:00:00Z" w16du:dateUtc="2026-03-01T21:00:00Z">
               <w:r>
                 <w:rPr>
                   <w:rFonts w:asciiTheme="majorHAnsi" w:hAnsiTheme="majorHAnsi" w:cstheme="majorHAnsi"/>
@@ -6538,8 +6554,8 @@
                 <w:t xml:space="preserve">Participants can contact </w:t>
               </w:r>
             </w:ins>
-            <w:ins w:id="8" w:author="Alexander Gordon (Student)" w:date="2026-03-01T21:01:00Z" w16du:dateUtc="2026-03-01T21:01:00Z">
-              <w:del w:id="9" w:author="Oluwafemi Samuel (Staff)" w:date="2026-03-02T08:22:00Z" w16du:dateUtc="2026-03-02T08:22:00Z">
+            <w:ins w:id="10" w:author="Alexander Gordon (Student)" w:date="2026-03-01T21:01:00Z" w16du:dateUtc="2026-03-01T21:01:00Z">
+              <w:del w:id="11" w:author="Oluwafemi Samuel (Staff)" w:date="2026-03-02T08:22:00Z" w16du:dateUtc="2026-03-02T08:22:00Z">
                 <w:r>
                   <w:rPr>
                     <w:rFonts w:asciiTheme="majorHAnsi" w:hAnsiTheme="majorHAnsi" w:cstheme="majorHAnsi"/>
@@ -6548,7 +6564,7 @@
                 </w:r>
               </w:del>
             </w:ins>
-            <w:ins w:id="10" w:author="Oluwafemi Samuel (Staff)" w:date="2026-03-02T08:22:00Z" w16du:dateUtc="2026-03-02T08:22:00Z">
+            <w:ins w:id="12" w:author="Oluwafemi Samuel (Staff)" w:date="2026-03-02T08:22:00Z" w16du:dateUtc="2026-03-02T08:22:00Z">
               <w:r>
                 <w:rPr>
                   <w:rFonts w:asciiTheme="majorHAnsi" w:hAnsiTheme="majorHAnsi" w:cstheme="majorHAnsi"/>
@@ -6556,7 +6572,7 @@
                 <w:t>the principal investigator</w:t>
               </w:r>
             </w:ins>
-            <w:ins w:id="11" w:author="Alexander Gordon (Student)" w:date="2026-03-01T21:01:00Z" w16du:dateUtc="2026-03-01T21:01:00Z">
+            <w:ins w:id="13" w:author="Alexander Gordon (Student)" w:date="2026-03-01T21:01:00Z" w16du:dateUtc="2026-03-01T21:01:00Z">
               <w:r>
                 <w:rPr>
                   <w:rFonts w:asciiTheme="majorHAnsi" w:hAnsiTheme="majorHAnsi" w:cstheme="majorHAnsi"/>
@@ -6564,14 +6580,14 @@
                 <w:t xml:space="preserve"> and request their information to be removed. They will need to provide their toke</w:t>
               </w:r>
             </w:ins>
-            <w:ins w:id="12" w:author="Alexander Gordon (Student)" w:date="2026-03-01T21:03:00Z" w16du:dateUtc="2026-03-01T21:03:00Z">
+            <w:ins w:id="14" w:author="Alexander Gordon (Student)" w:date="2026-03-01T21:03:00Z" w16du:dateUtc="2026-03-01T21:03:00Z">
               <w:r>
                 <w:rPr>
                   <w:rFonts w:asciiTheme="majorHAnsi" w:hAnsiTheme="majorHAnsi" w:cstheme="majorHAnsi"/>
                 </w:rPr>
                 <w:t>n</w:t>
               </w:r>
-              <w:del w:id="13" w:author="Oluwafemi Samuel (Staff)" w:date="2026-03-02T08:23:00Z" w16du:dateUtc="2026-03-02T08:23:00Z">
+              <w:del w:id="15" w:author="Oluwafemi Samuel (Staff)" w:date="2026-03-02T08:23:00Z" w16du:dateUtc="2026-03-02T08:23:00Z">
                 <w:r>
                   <w:rPr>
                     <w:rFonts w:asciiTheme="majorHAnsi" w:hAnsiTheme="majorHAnsi" w:cstheme="majorHAnsi"/>
@@ -6580,7 +6596,7 @@
                 </w:r>
               </w:del>
             </w:ins>
-            <w:ins w:id="14" w:author="Alexander Gordon (Student)" w:date="2026-03-01T21:01:00Z" w16du:dateUtc="2026-03-01T21:01:00Z">
+            <w:ins w:id="16" w:author="Alexander Gordon (Student)" w:date="2026-03-01T21:01:00Z" w16du:dateUtc="2026-03-01T21:01:00Z">
               <w:r>
                 <w:rPr>
                   <w:rFonts w:asciiTheme="majorHAnsi" w:hAnsiTheme="majorHAnsi" w:cstheme="majorHAnsi"/>
@@ -6594,14 +6610,14 @@
                 <w:t xml:space="preserve">Without </w:t>
               </w:r>
             </w:ins>
-            <w:ins w:id="15" w:author="Alexander Gordon (Student)" w:date="2026-03-01T21:02:00Z" w16du:dateUtc="2026-03-01T21:02:00Z">
+            <w:ins w:id="17" w:author="Alexander Gordon (Student)" w:date="2026-03-01T21:02:00Z" w16du:dateUtc="2026-03-01T21:02:00Z">
               <w:r>
                 <w:rPr>
                   <w:rFonts w:asciiTheme="majorHAnsi" w:hAnsiTheme="majorHAnsi" w:cstheme="majorHAnsi"/>
                 </w:rPr>
                 <w:t xml:space="preserve">this token it is impossible for </w:t>
               </w:r>
-              <w:del w:id="16" w:author="Oluwafemi Samuel (Staff)" w:date="2026-03-02T08:23:00Z" w16du:dateUtc="2026-03-02T08:23:00Z">
+              <w:del w:id="18" w:author="Oluwafemi Samuel (Staff)" w:date="2026-03-02T08:23:00Z" w16du:dateUtc="2026-03-02T08:23:00Z">
                 <w:r>
                   <w:rPr>
                     <w:rFonts w:asciiTheme="majorHAnsi" w:hAnsiTheme="majorHAnsi" w:cstheme="majorHAnsi"/>
@@ -6610,7 +6626,7 @@
                 </w:r>
               </w:del>
             </w:ins>
-            <w:ins w:id="17" w:author="Oluwafemi Samuel (Staff)" w:date="2026-03-02T08:23:00Z" w16du:dateUtc="2026-03-02T08:23:00Z">
+            <w:ins w:id="19" w:author="Oluwafemi Samuel (Staff)" w:date="2026-03-02T08:23:00Z" w16du:dateUtc="2026-03-02T08:23:00Z">
               <w:r>
                 <w:rPr>
                   <w:rFonts w:asciiTheme="majorHAnsi" w:hAnsiTheme="majorHAnsi" w:cstheme="majorHAnsi"/>
@@ -6618,7 +6634,7 @@
                 <w:t>the principal investigation</w:t>
               </w:r>
             </w:ins>
-            <w:ins w:id="18" w:author="Alexander Gordon (Student)" w:date="2026-03-01T21:02:00Z" w16du:dateUtc="2026-03-01T21:02:00Z">
+            <w:ins w:id="20" w:author="Alexander Gordon (Student)" w:date="2026-03-01T21:02:00Z" w16du:dateUtc="2026-03-01T21:02:00Z">
               <w:r>
                 <w:rPr>
                   <w:rFonts w:asciiTheme="majorHAnsi" w:hAnsiTheme="majorHAnsi" w:cstheme="majorHAnsi"/>
@@ -6626,7 +6642,7 @@
                 <w:t xml:space="preserve"> to identify their information. On</w:t>
               </w:r>
             </w:ins>
-            <w:ins w:id="19" w:author="Alexander Gordon (Student)" w:date="2026-03-01T21:03:00Z" w16du:dateUtc="2026-03-01T21:03:00Z">
+            <w:ins w:id="21" w:author="Alexander Gordon (Student)" w:date="2026-03-01T21:03:00Z" w16du:dateUtc="2026-03-01T21:03:00Z">
               <w:r>
                 <w:rPr>
                   <w:rFonts w:asciiTheme="majorHAnsi" w:hAnsiTheme="majorHAnsi" w:cstheme="majorHAnsi"/>
@@ -6634,7 +6650,7 @@
                 <w:t>c</w:t>
               </w:r>
             </w:ins>
-            <w:ins w:id="20" w:author="Alexander Gordon (Student)" w:date="2026-03-01T21:02:00Z" w16du:dateUtc="2026-03-01T21:02:00Z">
+            <w:ins w:id="22" w:author="Alexander Gordon (Student)" w:date="2026-03-01T21:02:00Z" w16du:dateUtc="2026-03-01T21:02:00Z">
               <w:r>
                 <w:rPr>
                   <w:rFonts w:asciiTheme="majorHAnsi" w:hAnsiTheme="majorHAnsi" w:cstheme="majorHAnsi"/>
@@ -6642,7 +6658,7 @@
                 <w:t xml:space="preserve">e the request is made and a token provided the participants data will be removed from the study. </w:t>
               </w:r>
             </w:ins>
-            <w:ins w:id="21" w:author="Alexander Gordon (Student)" w:date="2026-03-01T21:03:00Z" w16du:dateUtc="2026-03-01T21:03:00Z">
+            <w:ins w:id="23" w:author="Alexander Gordon (Student)" w:date="2026-03-01T21:03:00Z" w16du:dateUtc="2026-03-01T21:03:00Z">
               <w:r>
                 <w:rPr>
                   <w:rFonts w:asciiTheme="majorHAnsi" w:hAnsiTheme="majorHAnsi" w:cstheme="majorHAnsi"/>
@@ -6650,14 +6666,14 @@
                 <w:t>Removal of data will not be possible two</w:t>
               </w:r>
             </w:ins>
-            <w:ins w:id="22" w:author="Alexander Gordon (Student)" w:date="2026-03-01T21:04:00Z" w16du:dateUtc="2026-03-01T21:04:00Z">
+            <w:ins w:id="24" w:author="Alexander Gordon (Student)" w:date="2026-03-01T21:04:00Z" w16du:dateUtc="2026-03-01T21:04:00Z">
               <w:r>
                 <w:rPr>
                   <w:rFonts w:asciiTheme="majorHAnsi" w:hAnsiTheme="majorHAnsi" w:cstheme="majorHAnsi"/>
                 </w:rPr>
                 <w:t xml:space="preserve"> weeks after the </w:t>
               </w:r>
-              <w:del w:id="23" w:author="Oluwafemi Samuel (Staff)" w:date="2026-03-02T08:24:00Z" w16du:dateUtc="2026-03-02T08:24:00Z">
+              <w:del w:id="25" w:author="Oluwafemi Samuel (Staff)" w:date="2026-03-02T08:24:00Z" w16du:dateUtc="2026-03-02T08:24:00Z">
                 <w:r>
                   <w:rPr>
                     <w:rFonts w:asciiTheme="majorHAnsi" w:hAnsiTheme="majorHAnsi" w:cstheme="majorHAnsi"/>
@@ -6666,7 +6682,7 @@
                 </w:r>
               </w:del>
             </w:ins>
-            <w:ins w:id="24" w:author="Oluwafemi Samuel (Staff)" w:date="2026-03-02T08:24:00Z" w16du:dateUtc="2026-03-02T08:24:00Z">
+            <w:ins w:id="26" w:author="Oluwafemi Samuel (Staff)" w:date="2026-03-02T08:24:00Z" w16du:dateUtc="2026-03-02T08:24:00Z">
               <w:r>
                 <w:rPr>
                   <w:rFonts w:asciiTheme="majorHAnsi" w:hAnsiTheme="majorHAnsi" w:cstheme="majorHAnsi"/>
@@ -6680,8 +6696,8 @@
                 <w:t>their data</w:t>
               </w:r>
             </w:ins>
-            <w:ins w:id="25" w:author="Alexander Gordon (Student)" w:date="2026-03-01T21:04:00Z" w16du:dateUtc="2026-03-01T21:04:00Z">
-              <w:del w:id="26" w:author="Oluwafemi Samuel (Staff)" w:date="2026-03-02T08:24:00Z" w16du:dateUtc="2026-03-02T08:24:00Z">
+            <w:ins w:id="27" w:author="Alexander Gordon (Student)" w:date="2026-03-01T21:04:00Z" w16du:dateUtc="2026-03-01T21:04:00Z">
+              <w:del w:id="28" w:author="Oluwafemi Samuel (Staff)" w:date="2026-03-02T08:24:00Z" w16du:dateUtc="2026-03-02T08:24:00Z">
                 <w:r>
                   <w:rPr>
                     <w:rFonts w:asciiTheme="majorHAnsi" w:hAnsiTheme="majorHAnsi" w:cstheme="majorHAnsi"/>
@@ -8805,7 +8821,7 @@
                 <w:rFonts w:asciiTheme="majorHAnsi" w:hAnsiTheme="majorHAnsi" w:cstheme="majorHAnsi"/>
               </w:rPr>
             </w:pPr>
-            <w:bookmarkStart w:id="27" w:name="_Hlk191902255"/>
+            <w:bookmarkStart w:id="29" w:name="_Hlk191902255"/>
           </w:p>
         </w:tc>
         <w:tc>
@@ -9217,7 +9233,7 @@
           </w:p>
         </w:tc>
       </w:tr>
-      <w:bookmarkEnd w:id="27"/>
+      <w:bookmarkEnd w:id="29"/>
     </w:tbl>
     <w:p>
       <w:pPr>
@@ -9533,7 +9549,7 @@
                 <w:rFonts w:asciiTheme="majorHAnsi" w:hAnsiTheme="majorHAnsi" w:cstheme="majorHAnsi"/>
               </w:rPr>
             </w:pPr>
-            <w:bookmarkStart w:id="28" w:name="_Hlk191902319"/>
+            <w:bookmarkStart w:id="30" w:name="_Hlk191902319"/>
             <w:r>
               <w:rPr>
                 <w:rFonts w:asciiTheme="majorHAnsi" w:hAnsiTheme="majorHAnsi" w:cstheme="majorHAnsi"/>
@@ -9642,15 +9658,15 @@
               </w:rPr>
               <w:t xml:space="preserve"> Last Updated </w:t>
             </w:r>
-            <w:ins w:id="29" w:author="Alexander Gordon (Student)" w:date="2026-03-01T21:14:00Z" w16du:dateUtc="2026-03-01T21:14:00Z">
+            <w:ins w:id="31" w:author="Alexander Gordon (Student)" w:date="2026-03-04T14:37:00Z" w16du:dateUtc="2026-03-04T14:37:00Z">
               <w:r>
                 <w:rPr>
                   <w:rFonts w:asciiTheme="majorHAnsi" w:hAnsiTheme="majorHAnsi" w:cstheme="majorHAnsi"/>
                 </w:rPr>
-                <w:t>1</w:t>
+                <w:t>4</w:t>
               </w:r>
             </w:ins>
-            <w:del w:id="30" w:author="Alexander Gordon (Student)" w:date="2026-03-01T21:14:00Z" w16du:dateUtc="2026-03-01T21:14:00Z">
+            <w:del w:id="32" w:author="Alexander Gordon (Student)" w:date="2026-03-01T21:14:00Z" w16du:dateUtc="2026-03-01T21:14:00Z">
               <w:r>
                 <w:rPr>
                   <w:rFonts w:asciiTheme="majorHAnsi" w:hAnsiTheme="majorHAnsi" w:cstheme="majorHAnsi"/>
@@ -9664,7 +9680,7 @@
               </w:rPr>
               <w:t xml:space="preserve"> </w:t>
             </w:r>
-            <w:del w:id="31" w:author="Alexander Gordon (Student)" w:date="2026-03-01T21:14:00Z" w16du:dateUtc="2026-03-01T21:14:00Z">
+            <w:del w:id="33" w:author="Alexander Gordon (Student)" w:date="2026-03-01T21:14:00Z" w16du:dateUtc="2026-03-01T21:14:00Z">
               <w:r>
                 <w:rPr>
                   <w:rFonts w:asciiTheme="majorHAnsi" w:hAnsiTheme="majorHAnsi" w:cstheme="majorHAnsi"/>
@@ -9672,7 +9688,7 @@
                 <w:delText xml:space="preserve">February </w:delText>
               </w:r>
             </w:del>
-            <w:ins w:id="32" w:author="Alexander Gordon (Student)" w:date="2026-03-01T21:14:00Z" w16du:dateUtc="2026-03-01T21:14:00Z">
+            <w:ins w:id="34" w:author="Alexander Gordon (Student)" w:date="2026-03-01T21:14:00Z" w16du:dateUtc="2026-03-01T21:14:00Z">
               <w:r>
                 <w:rPr>
                   <w:rFonts w:asciiTheme="majorHAnsi" w:hAnsiTheme="majorHAnsi" w:cstheme="majorHAnsi"/>
@@ -9782,7 +9798,7 @@
               </w:rPr>
               <w:t xml:space="preserve">. Last Updated </w:t>
             </w:r>
-            <w:del w:id="33" w:author="Alexander Gordon (Student)" w:date="2026-03-01T21:15:00Z" w16du:dateUtc="2026-03-01T21:15:00Z">
+            <w:del w:id="35" w:author="Alexander Gordon (Student)" w:date="2026-03-01T21:15:00Z" w16du:dateUtc="2026-03-01T21:15:00Z">
               <w:r>
                 <w:rPr>
                   <w:rFonts w:asciiTheme="majorHAnsi" w:hAnsiTheme="majorHAnsi" w:cstheme="majorHAnsi"/>
@@ -9796,7 +9812,7 @@
                 <w:delText xml:space="preserve"> </w:delText>
               </w:r>
             </w:del>
-            <w:ins w:id="34" w:author="Alexander Gordon (Student)" w:date="2026-03-01T21:15:00Z" w16du:dateUtc="2026-03-01T21:15:00Z">
+            <w:ins w:id="36" w:author="Alexander Gordon (Student)" w:date="2026-03-01T21:15:00Z" w16du:dateUtc="2026-03-01T21:15:00Z">
               <w:r>
                 <w:rPr>
                   <w:rFonts w:asciiTheme="majorHAnsi" w:hAnsiTheme="majorHAnsi" w:cstheme="majorHAnsi"/>
@@ -9810,7 +9826,7 @@
                 <w:t xml:space="preserve"> </w:t>
               </w:r>
             </w:ins>
-            <w:del w:id="35" w:author="Alexander Gordon (Student)" w:date="2026-03-01T21:15:00Z" w16du:dateUtc="2026-03-01T21:15:00Z">
+            <w:del w:id="37" w:author="Alexander Gordon (Student)" w:date="2026-03-01T21:15:00Z" w16du:dateUtc="2026-03-01T21:15:00Z">
               <w:r>
                 <w:rPr>
                   <w:rFonts w:asciiTheme="majorHAnsi" w:hAnsiTheme="majorHAnsi" w:cstheme="majorHAnsi"/>
@@ -9818,7 +9834,7 @@
                 <w:delText xml:space="preserve">February </w:delText>
               </w:r>
             </w:del>
-            <w:ins w:id="36" w:author="Alexander Gordon (Student)" w:date="2026-03-01T21:15:00Z" w16du:dateUtc="2026-03-01T21:15:00Z">
+            <w:ins w:id="38" w:author="Alexander Gordon (Student)" w:date="2026-03-01T21:15:00Z" w16du:dateUtc="2026-03-01T21:15:00Z">
               <w:r>
                 <w:rPr>
                   <w:rFonts w:asciiTheme="majorHAnsi" w:hAnsiTheme="majorHAnsi" w:cstheme="majorHAnsi"/>
@@ -9886,7 +9902,7 @@
               </w:rPr>
               <w:t xml:space="preserve">. Last Updated </w:t>
             </w:r>
-            <w:ins w:id="37" w:author="Alexander Gordon (Student)" w:date="2026-03-01T21:15:00Z" w16du:dateUtc="2026-03-01T21:15:00Z">
+            <w:ins w:id="39" w:author="Alexander Gordon (Student)" w:date="2026-03-01T21:15:00Z" w16du:dateUtc="2026-03-01T21:15:00Z">
               <w:r>
                 <w:rPr>
                   <w:rFonts w:asciiTheme="majorHAnsi" w:hAnsiTheme="majorHAnsi" w:cstheme="majorHAnsi"/>
@@ -9894,7 +9910,7 @@
                 <w:t>1</w:t>
               </w:r>
             </w:ins>
-            <w:del w:id="38" w:author="Alexander Gordon (Student)" w:date="2026-03-01T21:15:00Z" w16du:dateUtc="2026-03-01T21:15:00Z">
+            <w:del w:id="40" w:author="Alexander Gordon (Student)" w:date="2026-03-01T21:15:00Z" w16du:dateUtc="2026-03-01T21:15:00Z">
               <w:r>
                 <w:rPr>
                   <w:rFonts w:asciiTheme="majorHAnsi" w:hAnsiTheme="majorHAnsi" w:cstheme="majorHAnsi"/>
@@ -9902,7 +9918,7 @@
                 <w:delText>2</w:delText>
               </w:r>
             </w:del>
-            <w:del w:id="39" w:author="Alexander Gordon (Student)" w:date="2026-03-01T21:14:00Z" w16du:dateUtc="2026-03-01T21:14:00Z">
+            <w:del w:id="41" w:author="Alexander Gordon (Student)" w:date="2026-03-01T21:14:00Z" w16du:dateUtc="2026-03-01T21:14:00Z">
               <w:r>
                 <w:rPr>
                   <w:rFonts w:asciiTheme="majorHAnsi" w:hAnsiTheme="majorHAnsi" w:cstheme="majorHAnsi"/>
@@ -9916,7 +9932,7 @@
               </w:rPr>
               <w:t xml:space="preserve"> </w:t>
             </w:r>
-            <w:del w:id="40" w:author="Alexander Gordon (Student)" w:date="2026-03-01T21:14:00Z" w16du:dateUtc="2026-03-01T21:14:00Z">
+            <w:del w:id="42" w:author="Alexander Gordon (Student)" w:date="2026-03-01T21:14:00Z" w16du:dateUtc="2026-03-01T21:14:00Z">
               <w:r>
                 <w:rPr>
                   <w:rFonts w:asciiTheme="majorHAnsi" w:hAnsiTheme="majorHAnsi" w:cstheme="majorHAnsi"/>
@@ -9924,7 +9940,7 @@
                 <w:delText xml:space="preserve">February </w:delText>
               </w:r>
             </w:del>
-            <w:ins w:id="41" w:author="Alexander Gordon (Student)" w:date="2026-03-01T21:14:00Z" w16du:dateUtc="2026-03-01T21:14:00Z">
+            <w:ins w:id="43" w:author="Alexander Gordon (Student)" w:date="2026-03-01T21:14:00Z" w16du:dateUtc="2026-03-01T21:14:00Z">
               <w:r>
                 <w:rPr>
                   <w:rFonts w:asciiTheme="majorHAnsi" w:hAnsiTheme="majorHAnsi" w:cstheme="majorHAnsi"/>
@@ -10049,7 +10065,7 @@
           </w:p>
         </w:tc>
       </w:tr>
-      <w:bookmarkEnd w:id="28"/>
+      <w:bookmarkEnd w:id="30"/>
     </w:tbl>
     <w:p>
       <w:pPr>
@@ -10563,7 +10579,7 @@
         </w:rPr>
         <w:t xml:space="preserve"> </w:t>
       </w:r>
-      <w:ins w:id="42" w:author="Alexander Gordon (Student)" w:date="2026-03-02T11:07:00Z" w16du:dateUtc="2026-03-02T11:07:00Z">
+      <w:ins w:id="44" w:author="Alexander Gordon (Student)" w:date="2026-03-02T11:07:00Z" w16du:dateUtc="2026-03-02T11:07:00Z">
         <w:r>
           <w:rPr>
             <w:rFonts w:asciiTheme="majorHAnsi" w:hAnsiTheme="majorHAnsi" w:cstheme="majorHAnsi"/>
@@ -10571,7 +10587,7 @@
           <w:t>2</w:t>
         </w:r>
       </w:ins>
-      <w:del w:id="43" w:author="Alexander Gordon (Student)" w:date="2026-03-02T11:07:00Z" w16du:dateUtc="2026-03-02T11:07:00Z">
+      <w:del w:id="45" w:author="Alexander Gordon (Student)" w:date="2026-03-02T11:07:00Z" w16du:dateUtc="2026-03-02T11:07:00Z">
         <w:r>
           <w:rPr>
             <w:rFonts w:asciiTheme="majorHAnsi" w:hAnsiTheme="majorHAnsi" w:cstheme="majorHAnsi"/>
@@ -10591,7 +10607,7 @@
         </w:rPr>
         <w:t>/0</w:t>
       </w:r>
-      <w:ins w:id="44" w:author="Alexander Gordon (Student)" w:date="2026-03-02T11:07:00Z" w16du:dateUtc="2026-03-02T11:07:00Z">
+      <w:ins w:id="46" w:author="Alexander Gordon (Student)" w:date="2026-03-02T11:07:00Z" w16du:dateUtc="2026-03-02T11:07:00Z">
         <w:r>
           <w:rPr>
             <w:rFonts w:asciiTheme="majorHAnsi" w:hAnsiTheme="majorHAnsi" w:cstheme="majorHAnsi"/>
@@ -10599,7 +10615,7 @@
           <w:t>3</w:t>
         </w:r>
       </w:ins>
-      <w:del w:id="45" w:author="Alexander Gordon (Student)" w:date="2026-03-02T11:07:00Z" w16du:dateUtc="2026-03-02T11:07:00Z">
+      <w:del w:id="47" w:author="Alexander Gordon (Student)" w:date="2026-03-02T11:07:00Z" w16du:dateUtc="2026-03-02T11:07:00Z">
         <w:r>
           <w:rPr>
             <w:rFonts w:asciiTheme="majorHAnsi" w:hAnsiTheme="majorHAnsi" w:cstheme="majorHAnsi"/>
@@ -16557,10 +16573,27 @@
 </file>
 
 <file path=customXml/item1.xml><?xml version="1.0" encoding="utf-8"?>
+<?mso-contentType ?>
+<FormTemplates xmlns="http://schemas.microsoft.com/sharepoint/v3/contenttype/forms">
+  <Display>DocumentLibraryForm</Display>
+  <Edit>DocumentLibraryForm</Edit>
+  <New>DocumentLibraryForm</New>
+</FormTemplates>
+</file>
+
+<file path=customXml/item2.xml><?xml version="1.0" encoding="utf-8"?>
+<p:properties xmlns:p="http://schemas.microsoft.com/office/2006/metadata/properties" xmlns:xsi="http://www.w3.org/2001/XMLSchema-instance" xmlns:pc="http://schemas.microsoft.com/office/infopath/2007/PartnerControls">
+  <documentManagement>
+    <_activity xmlns="57d8a762-ad9e-4d6d-b050-672b9de5a367" xsi:nil="true"/>
+  </documentManagement>
+</p:properties>
+</file>
+
+<file path=customXml/item3.xml><?xml version="1.0" encoding="utf-8"?>
 <b:Sources xmlns:b="http://schemas.openxmlformats.org/officeDocument/2006/bibliography" xmlns="http://schemas.openxmlformats.org/officeDocument/2006/bibliography" SelectedStyle="\APASixthEditionOfficeOnline.xsl" StyleName="APA" Version="6"/>
 </file>
 
-<file path=customXml/item2.xml><?xml version="1.0" encoding="utf-8"?>
+<file path=customXml/item4.xml><?xml version="1.0" encoding="utf-8"?>
 <ct:contentTypeSchema xmlns:ct="http://schemas.microsoft.com/office/2006/metadata/contentType" xmlns:ma="http://schemas.microsoft.com/office/2006/metadata/properties/metaAttributes" ct:_="" ma:_="" ma:contentTypeName="Document" ma:contentTypeID="0x010100E21E2FC40F2F9849A2101429659C885F" ma:contentTypeVersion="18" ma:contentTypeDescription="Create a new document." ma:contentTypeScope="" ma:versionID="846039444d366d22fd92ed571c056e6a">
   <xsd:schema xmlns:xsd="http://www.w3.org/2001/XMLSchema" xmlns:xs="http://www.w3.org/2001/XMLSchema" xmlns:p="http://schemas.microsoft.com/office/2006/metadata/properties" xmlns:ns3="57d8a762-ad9e-4d6d-b050-672b9de5a367" xmlns:ns4="69302c11-379d-46f2-838b-87b5f21836a2" targetNamespace="http://schemas.microsoft.com/office/2006/metadata/properties" ma:root="true" ma:fieldsID="224c7245fac8abc9a7dcb4d94b86958a" ns3:_="" ns4:_="">
     <xsd:import namespace="57d8a762-ad9e-4d6d-b050-672b9de5a367"/>
@@ -16813,24 +16846,25 @@
 </ct:contentTypeSchema>
 </file>
 
-<file path=customXml/item3.xml><?xml version="1.0" encoding="utf-8"?>
-<?mso-contentType ?>
-<FormTemplates xmlns="http://schemas.microsoft.com/sharepoint/v3/contenttype/forms">
-  <Display>DocumentLibraryForm</Display>
-  <Edit>DocumentLibraryForm</Edit>
-  <New>DocumentLibraryForm</New>
-</FormTemplates>
+<file path=customXml/itemProps1.xml><?xml version="1.0" encoding="utf-8"?>
+<ds:datastoreItem xmlns:ds="http://schemas.openxmlformats.org/officeDocument/2006/customXml" ds:itemID="{DC8816E8-4B7F-4AFE-903F-4F41526C5A75}">
+  <ds:schemaRefs>
+    <ds:schemaRef ds:uri="http://schemas.microsoft.com/sharepoint/v3/contenttype/forms"/>
+  </ds:schemaRefs>
+</ds:datastoreItem>
 </file>
 
-<file path=customXml/item4.xml><?xml version="1.0" encoding="utf-8"?>
-<p:properties xmlns:p="http://schemas.microsoft.com/office/2006/metadata/properties" xmlns:xsi="http://www.w3.org/2001/XMLSchema-instance" xmlns:pc="http://schemas.microsoft.com/office/infopath/2007/PartnerControls">
-  <documentManagement>
-    <_activity xmlns="57d8a762-ad9e-4d6d-b050-672b9de5a367" xsi:nil="true"/>
-  </documentManagement>
-</p:properties>
+<file path=customXml/itemProps2.xml><?xml version="1.0" encoding="utf-8"?>
+<ds:datastoreItem xmlns:ds="http://schemas.openxmlformats.org/officeDocument/2006/customXml" ds:itemID="{5F094DC4-E785-4ACF-8C93-6A017C0AE2A7}">
+  <ds:schemaRefs>
+    <ds:schemaRef ds:uri="http://schemas.microsoft.com/office/2006/metadata/properties"/>
+    <ds:schemaRef ds:uri="http://schemas.microsoft.com/office/infopath/2007/PartnerControls"/>
+    <ds:schemaRef ds:uri="57d8a762-ad9e-4d6d-b050-672b9de5a367"/>
+  </ds:schemaRefs>
+</ds:datastoreItem>
 </file>
 
-<file path=customXml/itemProps1.xml><?xml version="1.0" encoding="utf-8"?>
+<file path=customXml/itemProps3.xml><?xml version="1.0" encoding="utf-8"?>
 <ds:datastoreItem xmlns:ds="http://schemas.openxmlformats.org/officeDocument/2006/customXml" ds:itemID="{2F9030A0-6EE7-44DE-95FE-59CC9C6157CE}">
   <ds:schemaRefs>
     <ds:schemaRef ds:uri="http://schemas.openxmlformats.org/officeDocument/2006/bibliography"/>
@@ -16838,7 +16872,7 @@
 </ds:datastoreItem>
 </file>
 
-<file path=customXml/itemProps2.xml><?xml version="1.0" encoding="utf-8"?>
+<file path=customXml/itemProps4.xml><?xml version="1.0" encoding="utf-8"?>
 <ds:datastoreItem xmlns:ds="http://schemas.openxmlformats.org/officeDocument/2006/customXml" ds:itemID="{44161078-4144-4F37-800E-D77C820BE783}">
   <ds:schemaRefs>
     <ds:schemaRef ds:uri="http://schemas.microsoft.com/office/2006/metadata/contentType"/>
@@ -16855,22 +16889,4 @@
     <ds:schemaRef ds:uri="http://schemas.microsoft.com/internal/obd"/>
   </ds:schemaRefs>
 </ds:datastoreItem>
-</file>
-
-<file path=customXml/itemProps3.xml><?xml version="1.0" encoding="utf-8"?>
-<ds:datastoreItem xmlns:ds="http://schemas.openxmlformats.org/officeDocument/2006/customXml" ds:itemID="{DC8816E8-4B7F-4AFE-903F-4F41526C5A75}">
-  <ds:schemaRefs>
-    <ds:schemaRef ds:uri="http://schemas.microsoft.com/sharepoint/v3/contenttype/forms"/>
-  </ds:schemaRefs>
-</ds:datastoreItem>
-</file>
-
-<file path=customXml/itemProps4.xml><?xml version="1.0" encoding="utf-8"?>
-<ds:datastoreItem xmlns:ds="http://schemas.openxmlformats.org/officeDocument/2006/customXml" ds:itemID="{5F094DC4-E785-4ACF-8C93-6A017C0AE2A7}">
-  <ds:schemaRefs>
-    <ds:schemaRef ds:uri="http://schemas.microsoft.com/office/2006/metadata/properties"/>
-    <ds:schemaRef ds:uri="http://schemas.microsoft.com/office/infopath/2007/PartnerControls"/>
-    <ds:schemaRef ds:uri="57d8a762-ad9e-4d6d-b050-672b9de5a367"/>
-  </ds:schemaRefs>
-</ds:datastoreItem>
 </file>
</xml_diff>